<commit_message>
Add polished one-page employee registration and salary utility Tkinter app
</commit_message>
<xml_diff>
--- a/AI ASSIGNMENT 2/AI-Assignment-02-M-Hamza.docx
+++ b/AI ASSIGNMENT 2/AI-Assignment-02-M-Hamza.docx
@@ -23,12 +23,6 @@
         <w:gridCol w:w="12240"/>
       </w:tblGrid>
       <w:tr>
-        <w:tblPrEx>
-          <w:tblCellMar>
-            <w:top w:w="0" w:type="dxa"/>
-            <w:bottom w:w="0" w:type="dxa"/>
-          </w:tblCellMar>
-        </w:tblPrEx>
         <w:tc>
           <w:tcPr>
             <w:tcW w:w="12240" w:type="dxa"/>
@@ -138,20 +132,48 @@
           <w:sz w:val="24"/>
           <w:szCs w:val="24"/>
         </w:rPr>
-        <w:t>Assignment #2  |  Artificial Intelligence</w:t>
-      </w:r>
-    </w:p>
-    <w:p>
-      <w:pPr>
-        <w:spacing w:after="80"/>
-        <w:jc w:val="center"/>
-      </w:pPr>
+        <w:t>Assignment #</w:t>
+      </w:r>
       <w:r>
         <w:rPr>
           <w:sz w:val="24"/>
           <w:szCs w:val="24"/>
         </w:rPr>
-        <w:t>BSE-6A  |  6th Semester</w:t>
+        <w:t>2 | Artificial</w:t>
+      </w:r>
+      <w:r>
+        <w:rPr>
+          <w:sz w:val="24"/>
+          <w:szCs w:val="24"/>
+        </w:rPr>
+        <w:t xml:space="preserve"> Intelligence</w:t>
+      </w:r>
+    </w:p>
+    <w:p>
+      <w:pPr>
+        <w:spacing w:after="80"/>
+        <w:jc w:val="center"/>
+      </w:pPr>
+      <w:r>
+        <w:rPr>
+          <w:sz w:val="24"/>
+          <w:szCs w:val="24"/>
+        </w:rPr>
+        <w:t>BSE-6</w:t>
+      </w:r>
+      <w:r>
+        <w:rPr>
+          <w:sz w:val="24"/>
+          <w:szCs w:val="24"/>
+        </w:rPr>
+        <w:t>A | 6</w:t>
+      </w:r>
+      <w:r>
+        <w:rPr>
+          <w:sz w:val="24"/>
+          <w:szCs w:val="24"/>
+        </w:rPr>
+        <w:t>th Semester</w:t>
       </w:r>
     </w:p>
     <w:p>
@@ -170,6 +192,7 @@
     <w:tbl>
       <w:tblPr>
         <w:tblW w:w="7200" w:type="dxa"/>
+        <w:tblInd w:w="2515" w:type="dxa"/>
         <w:tblBorders>
           <w:top w:val="single" w:sz="4" w:space="0" w:color="auto"/>
           <w:left w:val="single" w:sz="4" w:space="0" w:color="auto"/>
@@ -188,12 +211,6 @@
         <w:gridCol w:w="7200"/>
       </w:tblGrid>
       <w:tr>
-        <w:tblPrEx>
-          <w:tblCellMar>
-            <w:top w:w="0" w:type="dxa"/>
-            <w:bottom w:w="0" w:type="dxa"/>
-          </w:tblCellMar>
-        </w:tblPrEx>
         <w:tc>
           <w:tcPr>
             <w:tcW w:w="7200" w:type="dxa"/>
@@ -266,6 +283,16 @@
       </w:pPr>
       <w:r>
         <w:tab/>
+      </w:r>
+      <w:r>
+        <w:rPr>
+          <w:b/>
+          <w:bCs/>
+          <w:color w:val="1B3A6B"/>
+          <w:sz w:val="26"/>
+          <w:szCs w:val="26"/>
+        </w:rPr>
+        <w:t>GitHub Link:</w:t>
       </w:r>
       <w:r>
         <w:rPr>
@@ -275,13 +302,34 @@
           <w:sz w:val="30"/>
           <w:szCs w:val="30"/>
         </w:rPr>
-        <w:t xml:space="preserve">GitHub Link: </w:t>
-      </w:r>
-    </w:p>
-    <w:p>
-      <w:pPr>
-        <w:spacing w:before="500"/>
-      </w:pPr>
+        <w:t xml:space="preserve"> </w:t>
+      </w:r>
+      <w:hyperlink r:id="rId7" w:history="1">
+        <w:r>
+          <w:rPr>
+            <w:rStyle w:val="Hyperlink"/>
+            <w:sz w:val="20"/>
+            <w:szCs w:val="20"/>
+          </w:rPr>
+          <w:t>https://github.com/muhammadhamza7057/Machine-Learning-Master</w:t>
+        </w:r>
+        <w:r>
+          <w:rPr>
+            <w:rStyle w:val="Hyperlink"/>
+            <w:sz w:val="20"/>
+            <w:szCs w:val="20"/>
+          </w:rPr>
+          <w:t>y</w:t>
+        </w:r>
+        <w:r>
+          <w:rPr>
+            <w:rStyle w:val="Hyperlink"/>
+            <w:sz w:val="20"/>
+            <w:szCs w:val="20"/>
+          </w:rPr>
+          <w:t>/tree/main/AI%20ASSIGNMENT%202</w:t>
+        </w:r>
+      </w:hyperlink>
     </w:p>
     <w:p>
       <w:pPr>
@@ -309,12 +357,6 @@
         <w:gridCol w:w="12240"/>
       </w:tblGrid>
       <w:tr>
-        <w:tblPrEx>
-          <w:tblCellMar>
-            <w:top w:w="0" w:type="dxa"/>
-            <w:bottom w:w="0" w:type="dxa"/>
-          </w:tblCellMar>
-        </w:tblPrEx>
         <w:tc>
           <w:tcPr>
             <w:tcW w:w="12240" w:type="dxa"/>
@@ -342,7 +384,25 @@
                 <w:sz w:val="20"/>
                 <w:szCs w:val="20"/>
               </w:rPr>
-              <w:t>Bahria University  |  Islamabad Campus</w:t>
+              <w:t xml:space="preserve">Bahria </w:t>
+            </w:r>
+            <w:proofErr w:type="gramStart"/>
+            <w:r>
+              <w:rPr>
+                <w:color w:val="FFFFFF"/>
+                <w:sz w:val="20"/>
+                <w:szCs w:val="20"/>
+              </w:rPr>
+              <w:t>University  |</w:t>
+            </w:r>
+            <w:proofErr w:type="gramEnd"/>
+            <w:r>
+              <w:rPr>
+                <w:color w:val="FFFFFF"/>
+                <w:sz w:val="20"/>
+                <w:szCs w:val="20"/>
+              </w:rPr>
+              <w:t xml:space="preserve">  Islamabad Campus</w:t>
             </w:r>
           </w:p>
         </w:tc>
@@ -428,12 +488,6 @@
         <w:gridCol w:w="6200"/>
       </w:tblGrid>
       <w:tr>
-        <w:tblPrEx>
-          <w:tblCellMar>
-            <w:top w:w="0" w:type="dxa"/>
-            <w:bottom w:w="0" w:type="dxa"/>
-          </w:tblCellMar>
-        </w:tblPrEx>
         <w:trPr>
           <w:tblHeader/>
         </w:trPr>
@@ -507,12 +561,6 @@
         </w:tc>
       </w:tr>
       <w:tr>
-        <w:tblPrEx>
-          <w:tblCellMar>
-            <w:top w:w="0" w:type="dxa"/>
-            <w:bottom w:w="0" w:type="dxa"/>
-          </w:tblCellMar>
-        </w:tblPrEx>
         <w:tc>
           <w:tcPr>
             <w:tcW w:w="2800" w:type="dxa"/>
@@ -571,12 +619,6 @@
         </w:tc>
       </w:tr>
       <w:tr>
-        <w:tblPrEx>
-          <w:tblCellMar>
-            <w:top w:w="0" w:type="dxa"/>
-            <w:bottom w:w="0" w:type="dxa"/>
-          </w:tblCellMar>
-        </w:tblPrEx>
         <w:tc>
           <w:tcPr>
             <w:tcW w:w="2800" w:type="dxa"/>
@@ -635,12 +677,6 @@
         </w:tc>
       </w:tr>
       <w:tr>
-        <w:tblPrEx>
-          <w:tblCellMar>
-            <w:top w:w="0" w:type="dxa"/>
-            <w:bottom w:w="0" w:type="dxa"/>
-          </w:tblCellMar>
-        </w:tblPrEx>
         <w:tc>
           <w:tcPr>
             <w:tcW w:w="2800" w:type="dxa"/>
@@ -699,12 +735,6 @@
         </w:tc>
       </w:tr>
       <w:tr>
-        <w:tblPrEx>
-          <w:tblCellMar>
-            <w:top w:w="0" w:type="dxa"/>
-            <w:bottom w:w="0" w:type="dxa"/>
-          </w:tblCellMar>
-        </w:tblPrEx>
         <w:tc>
           <w:tcPr>
             <w:tcW w:w="2800" w:type="dxa"/>
@@ -812,12 +842,6 @@
         <w:gridCol w:w="4500"/>
       </w:tblGrid>
       <w:tr>
-        <w:tblPrEx>
-          <w:tblCellMar>
-            <w:top w:w="0" w:type="dxa"/>
-            <w:bottom w:w="0" w:type="dxa"/>
-          </w:tblCellMar>
-        </w:tblPrEx>
         <w:trPr>
           <w:tblHeader/>
         </w:trPr>
@@ -891,12 +915,6 @@
         </w:tc>
       </w:tr>
       <w:tr>
-        <w:tblPrEx>
-          <w:tblCellMar>
-            <w:top w:w="0" w:type="dxa"/>
-            <w:bottom w:w="0" w:type="dxa"/>
-          </w:tblCellMar>
-        </w:tblPrEx>
         <w:tc>
           <w:tcPr>
             <w:tcW w:w="4500" w:type="dxa"/>
@@ -955,12 +973,6 @@
         </w:tc>
       </w:tr>
       <w:tr>
-        <w:tblPrEx>
-          <w:tblCellMar>
-            <w:top w:w="0" w:type="dxa"/>
-            <w:bottom w:w="0" w:type="dxa"/>
-          </w:tblCellMar>
-        </w:tblPrEx>
         <w:tc>
           <w:tcPr>
             <w:tcW w:w="4500" w:type="dxa"/>
@@ -1019,12 +1031,6 @@
         </w:tc>
       </w:tr>
       <w:tr>
-        <w:tblPrEx>
-          <w:tblCellMar>
-            <w:top w:w="0" w:type="dxa"/>
-            <w:bottom w:w="0" w:type="dxa"/>
-          </w:tblCellMar>
-        </w:tblPrEx>
         <w:tc>
           <w:tcPr>
             <w:tcW w:w="4500" w:type="dxa"/>
@@ -1202,12 +1208,6 @@
         <w:gridCol w:w="6000"/>
       </w:tblGrid>
       <w:tr>
-        <w:tblPrEx>
-          <w:tblCellMar>
-            <w:top w:w="0" w:type="dxa"/>
-            <w:bottom w:w="0" w:type="dxa"/>
-          </w:tblCellMar>
-        </w:tblPrEx>
         <w:trPr>
           <w:tblHeader/>
         </w:trPr>
@@ -1281,12 +1281,6 @@
         </w:tc>
       </w:tr>
       <w:tr>
-        <w:tblPrEx>
-          <w:tblCellMar>
-            <w:top w:w="0" w:type="dxa"/>
-            <w:bottom w:w="0" w:type="dxa"/>
-          </w:tblCellMar>
-        </w:tblPrEx>
         <w:tc>
           <w:tcPr>
             <w:tcW w:w="3000" w:type="dxa"/>
@@ -1345,12 +1339,6 @@
         </w:tc>
       </w:tr>
       <w:tr>
-        <w:tblPrEx>
-          <w:tblCellMar>
-            <w:top w:w="0" w:type="dxa"/>
-            <w:bottom w:w="0" w:type="dxa"/>
-          </w:tblCellMar>
-        </w:tblPrEx>
         <w:tc>
           <w:tcPr>
             <w:tcW w:w="3000" w:type="dxa"/>
@@ -1425,12 +1413,6 @@
         </w:tc>
       </w:tr>
       <w:tr>
-        <w:tblPrEx>
-          <w:tblCellMar>
-            <w:top w:w="0" w:type="dxa"/>
-            <w:bottom w:w="0" w:type="dxa"/>
-          </w:tblCellMar>
-        </w:tblPrEx>
         <w:tc>
           <w:tcPr>
             <w:tcW w:w="3000" w:type="dxa"/>
@@ -1489,12 +1471,6 @@
         </w:tc>
       </w:tr>
       <w:tr>
-        <w:tblPrEx>
-          <w:tblCellMar>
-            <w:top w:w="0" w:type="dxa"/>
-            <w:bottom w:w="0" w:type="dxa"/>
-          </w:tblCellMar>
-        </w:tblPrEx>
         <w:tc>
           <w:tcPr>
             <w:tcW w:w="3000" w:type="dxa"/>
@@ -1649,12 +1625,6 @@
         <w:gridCol w:w="6000"/>
       </w:tblGrid>
       <w:tr>
-        <w:tblPrEx>
-          <w:tblCellMar>
-            <w:top w:w="0" w:type="dxa"/>
-            <w:bottom w:w="0" w:type="dxa"/>
-          </w:tblCellMar>
-        </w:tblPrEx>
         <w:trPr>
           <w:tblHeader/>
         </w:trPr>
@@ -1729,12 +1699,6 @@
         </w:tc>
       </w:tr>
       <w:tr>
-        <w:tblPrEx>
-          <w:tblCellMar>
-            <w:top w:w="0" w:type="dxa"/>
-            <w:bottom w:w="0" w:type="dxa"/>
-          </w:tblCellMar>
-        </w:tblPrEx>
         <w:tc>
           <w:tcPr>
             <w:tcW w:w="3000" w:type="dxa"/>
@@ -1793,12 +1757,6 @@
         </w:tc>
       </w:tr>
       <w:tr>
-        <w:tblPrEx>
-          <w:tblCellMar>
-            <w:top w:w="0" w:type="dxa"/>
-            <w:bottom w:w="0" w:type="dxa"/>
-          </w:tblCellMar>
-        </w:tblPrEx>
         <w:tc>
           <w:tcPr>
             <w:tcW w:w="3000" w:type="dxa"/>
@@ -1857,12 +1815,6 @@
         </w:tc>
       </w:tr>
       <w:tr>
-        <w:tblPrEx>
-          <w:tblCellMar>
-            <w:top w:w="0" w:type="dxa"/>
-            <w:bottom w:w="0" w:type="dxa"/>
-          </w:tblCellMar>
-        </w:tblPrEx>
         <w:tc>
           <w:tcPr>
             <w:tcW w:w="3000" w:type="dxa"/>
@@ -1987,7 +1939,15 @@
         <w:jc w:val="both"/>
       </w:pPr>
       <w:r>
-        <w:t>Within the 54 rows, two gap sizes are found: 25px (within one cell) and 150px (between Braille lines). Every three closely-spaced rows form one cell band. Spacing values are calibrated for this specific 2700x3500 image:</w:t>
+        <w:t xml:space="preserve">Within the 54 rows, two gap sizes are found: 25px (within one cell) and 150px (between Braille lines). Every three </w:t>
+      </w:r>
+      <w:proofErr w:type="gramStart"/>
+      <w:r>
+        <w:t>closely-spaced</w:t>
+      </w:r>
+      <w:proofErr w:type="gramEnd"/>
+      <w:r>
+        <w:t xml:space="preserve"> rows form one cell band. Spacing values are calibrated for this specific 2700x3500 image:</w:t>
       </w:r>
     </w:p>
     <w:p>
@@ -2017,12 +1977,6 @@
         <w:gridCol w:w="6800"/>
       </w:tblGrid>
       <w:tr>
-        <w:tblPrEx>
-          <w:tblCellMar>
-            <w:top w:w="0" w:type="dxa"/>
-            <w:bottom w:w="0" w:type="dxa"/>
-          </w:tblCellMar>
-        </w:tblPrEx>
         <w:trPr>
           <w:tblHeader/>
         </w:trPr>
@@ -2096,12 +2050,6 @@
         </w:tc>
       </w:tr>
       <w:tr>
-        <w:tblPrEx>
-          <w:tblCellMar>
-            <w:top w:w="0" w:type="dxa"/>
-            <w:bottom w:w="0" w:type="dxa"/>
-          </w:tblCellMar>
-        </w:tblPrEx>
         <w:tc>
           <w:tcPr>
             <w:tcW w:w="2200" w:type="dxa"/>
@@ -2178,12 +2126,6 @@
         </w:tc>
       </w:tr>
       <w:tr>
-        <w:tblPrEx>
-          <w:tblCellMar>
-            <w:top w:w="0" w:type="dxa"/>
-            <w:bottom w:w="0" w:type="dxa"/>
-          </w:tblCellMar>
-        </w:tblPrEx>
         <w:tc>
           <w:tcPr>
             <w:tcW w:w="2200" w:type="dxa"/>
@@ -2260,12 +2202,6 @@
         </w:tc>
       </w:tr>
       <w:tr>
-        <w:tblPrEx>
-          <w:tblCellMar>
-            <w:top w:w="0" w:type="dxa"/>
-            <w:bottom w:w="0" w:type="dxa"/>
-          </w:tblCellMar>
-        </w:tblPrEx>
         <w:tc>
           <w:tcPr>
             <w:tcW w:w="2200" w:type="dxa"/>
@@ -2342,12 +2278,6 @@
         </w:tc>
       </w:tr>
       <w:tr>
-        <w:tblPrEx>
-          <w:tblCellMar>
-            <w:top w:w="0" w:type="dxa"/>
-            <w:bottom w:w="0" w:type="dxa"/>
-          </w:tblCellMar>
-        </w:tblPrEx>
         <w:tc>
           <w:tcPr>
             <w:tcW w:w="2200" w:type="dxa"/>
@@ -2424,12 +2354,6 @@
         </w:tc>
       </w:tr>
       <w:tr>
-        <w:tblPrEx>
-          <w:tblCellMar>
-            <w:top w:w="0" w:type="dxa"/>
-            <w:bottom w:w="0" w:type="dxa"/>
-          </w:tblCellMar>
-        </w:tblPrEx>
         <w:tc>
           <w:tcPr>
             <w:tcW w:w="2200" w:type="dxa"/>
@@ -2580,7 +2504,15 @@
       </w:r>
       <w:proofErr w:type="spellEnd"/>
       <w:r>
-        <w:t>) X positions. It checks each dot position to see if a detected dot is within 13px of the target coordinate. If yes, the value is 1; if no, it is 0.</w:t>
+        <w:t xml:space="preserve">) X positions. It checks each dot position to see if a detected dot is within 13px of the target coordinate. If yes, the value is 1; if </w:t>
+      </w:r>
+      <w:proofErr w:type="gramStart"/>
+      <w:r>
+        <w:t>no</w:t>
+      </w:r>
+      <w:proofErr w:type="gramEnd"/>
+      <w:r>
+        <w:t>, it is 0.</w:t>
       </w:r>
     </w:p>
     <w:p>
@@ -2611,12 +2543,6 @@
         <w:gridCol w:w="5360"/>
       </w:tblGrid>
       <w:tr>
-        <w:tblPrEx>
-          <w:tblCellMar>
-            <w:top w:w="0" w:type="dxa"/>
-            <w:bottom w:w="0" w:type="dxa"/>
-          </w:tblCellMar>
-        </w:tblPrEx>
         <w:trPr>
           <w:tblHeader/>
         </w:trPr>
@@ -2724,12 +2650,6 @@
         </w:tc>
       </w:tr>
       <w:tr>
-        <w:tblPrEx>
-          <w:tblCellMar>
-            <w:top w:w="0" w:type="dxa"/>
-            <w:bottom w:w="0" w:type="dxa"/>
-          </w:tblCellMar>
-        </w:tblPrEx>
         <w:tc>
           <w:tcPr>
             <w:tcW w:w="1600" w:type="dxa"/>
@@ -2816,12 +2736,6 @@
         </w:tc>
       </w:tr>
       <w:tr>
-        <w:tblPrEx>
-          <w:tblCellMar>
-            <w:top w:w="0" w:type="dxa"/>
-            <w:bottom w:w="0" w:type="dxa"/>
-          </w:tblCellMar>
-        </w:tblPrEx>
         <w:tc>
           <w:tcPr>
             <w:tcW w:w="1600" w:type="dxa"/>
@@ -2908,12 +2822,6 @@
         </w:tc>
       </w:tr>
       <w:tr>
-        <w:tblPrEx>
-          <w:tblCellMar>
-            <w:top w:w="0" w:type="dxa"/>
-            <w:bottom w:w="0" w:type="dxa"/>
-          </w:tblCellMar>
-        </w:tblPrEx>
         <w:tc>
           <w:tcPr>
             <w:tcW w:w="1600" w:type="dxa"/>
@@ -3000,12 +2908,6 @@
         </w:tc>
       </w:tr>
       <w:tr>
-        <w:tblPrEx>
-          <w:tblCellMar>
-            <w:top w:w="0" w:type="dxa"/>
-            <w:bottom w:w="0" w:type="dxa"/>
-          </w:tblCellMar>
-        </w:tblPrEx>
         <w:tc>
           <w:tcPr>
             <w:tcW w:w="1600" w:type="dxa"/>
@@ -3101,12 +3003,6 @@
         </w:tc>
       </w:tr>
       <w:tr>
-        <w:tblPrEx>
-          <w:tblCellMar>
-            <w:top w:w="0" w:type="dxa"/>
-            <w:bottom w:w="0" w:type="dxa"/>
-          </w:tblCellMar>
-        </w:tblPrEx>
         <w:tc>
           <w:tcPr>
             <w:tcW w:w="1600" w:type="dxa"/>
@@ -3202,12 +3098,6 @@
         </w:tc>
       </w:tr>
       <w:tr>
-        <w:tblPrEx>
-          <w:tblCellMar>
-            <w:top w:w="0" w:type="dxa"/>
-            <w:bottom w:w="0" w:type="dxa"/>
-          </w:tblCellMar>
-        </w:tblPrEx>
         <w:tc>
           <w:tcPr>
             <w:tcW w:w="1600" w:type="dxa"/>
@@ -3339,12 +3229,6 @@
         <w:gridCol w:w="4560"/>
       </w:tblGrid>
       <w:tr>
-        <w:tblPrEx>
-          <w:tblCellMar>
-            <w:top w:w="0" w:type="dxa"/>
-            <w:bottom w:w="0" w:type="dxa"/>
-          </w:tblCellMar>
-        </w:tblPrEx>
         <w:trPr>
           <w:tblHeader/>
         </w:trPr>
@@ -3452,12 +3336,6 @@
         </w:tc>
       </w:tr>
       <w:tr>
-        <w:tblPrEx>
-          <w:tblCellMar>
-            <w:top w:w="0" w:type="dxa"/>
-            <w:bottom w:w="0" w:type="dxa"/>
-          </w:tblCellMar>
-        </w:tblPrEx>
         <w:tc>
           <w:tcPr>
             <w:tcW w:w="1400" w:type="dxa"/>
@@ -3544,12 +3422,6 @@
         </w:tc>
       </w:tr>
       <w:tr>
-        <w:tblPrEx>
-          <w:tblCellMar>
-            <w:top w:w="0" w:type="dxa"/>
-            <w:bottom w:w="0" w:type="dxa"/>
-          </w:tblCellMar>
-        </w:tblPrEx>
         <w:tc>
           <w:tcPr>
             <w:tcW w:w="1400" w:type="dxa"/>
@@ -3636,12 +3508,6 @@
         </w:tc>
       </w:tr>
       <w:tr>
-        <w:tblPrEx>
-          <w:tblCellMar>
-            <w:top w:w="0" w:type="dxa"/>
-            <w:bottom w:w="0" w:type="dxa"/>
-          </w:tblCellMar>
-        </w:tblPrEx>
         <w:tc>
           <w:tcPr>
             <w:tcW w:w="1400" w:type="dxa"/>
@@ -3728,12 +3594,6 @@
         </w:tc>
       </w:tr>
       <w:tr>
-        <w:tblPrEx>
-          <w:tblCellMar>
-            <w:top w:w="0" w:type="dxa"/>
-            <w:bottom w:w="0" w:type="dxa"/>
-          </w:tblCellMar>
-        </w:tblPrEx>
         <w:tc>
           <w:tcPr>
             <w:tcW w:w="1400" w:type="dxa"/>
@@ -3820,12 +3680,6 @@
         </w:tc>
       </w:tr>
       <w:tr>
-        <w:tblPrEx>
-          <w:tblCellMar>
-            <w:top w:w="0" w:type="dxa"/>
-            <w:bottom w:w="0" w:type="dxa"/>
-          </w:tblCellMar>
-        </w:tblPrEx>
         <w:tc>
           <w:tcPr>
             <w:tcW w:w="1400" w:type="dxa"/>
@@ -3942,7 +3796,15 @@
         <w:jc w:val="both"/>
       </w:pPr>
       <w:r>
-        <w:t>Classification uses a simple Python dictionary. Each possible 6-bit pattern maps directly to an English letter. There are 26 entries (a–z) plus one for a blank space. Lookup is instant — O(1). If a pattern is not found, a '?' is inserted for debugging.</w:t>
+        <w:t xml:space="preserve">Classification uses a simple Python dictionary. Each possible 6-bit pattern maps directly to an English letter. There are 26 entries (a–z) plus one for a blank space. Lookup is instant — </w:t>
+      </w:r>
+      <w:proofErr w:type="gramStart"/>
+      <w:r>
+        <w:t>O(</w:t>
+      </w:r>
+      <w:proofErr w:type="gramEnd"/>
+      <w:r>
+        <w:t>1). If a pattern is not found, a '?' is inserted for debugging.</w:t>
       </w:r>
     </w:p>
     <w:p>
@@ -3972,12 +3834,6 @@
         <w:gridCol w:w="5500"/>
       </w:tblGrid>
       <w:tr>
-        <w:tblPrEx>
-          <w:tblCellMar>
-            <w:top w:w="0" w:type="dxa"/>
-            <w:bottom w:w="0" w:type="dxa"/>
-          </w:tblCellMar>
-        </w:tblPrEx>
         <w:trPr>
           <w:tblHeader/>
         </w:trPr>
@@ -4051,12 +3907,6 @@
         </w:tc>
       </w:tr>
       <w:tr>
-        <w:tblPrEx>
-          <w:tblCellMar>
-            <w:top w:w="0" w:type="dxa"/>
-            <w:bottom w:w="0" w:type="dxa"/>
-          </w:tblCellMar>
-        </w:tblPrEx>
         <w:tc>
           <w:tcPr>
             <w:tcW w:w="3500" w:type="dxa"/>
@@ -4115,12 +3965,6 @@
         </w:tc>
       </w:tr>
       <w:tr>
-        <w:tblPrEx>
-          <w:tblCellMar>
-            <w:top w:w="0" w:type="dxa"/>
-            <w:bottom w:w="0" w:type="dxa"/>
-          </w:tblCellMar>
-        </w:tblPrEx>
         <w:tc>
           <w:tcPr>
             <w:tcW w:w="3500" w:type="dxa"/>
@@ -4179,12 +4023,6 @@
         </w:tc>
       </w:tr>
       <w:tr>
-        <w:tblPrEx>
-          <w:tblCellMar>
-            <w:top w:w="0" w:type="dxa"/>
-            <w:bottom w:w="0" w:type="dxa"/>
-          </w:tblCellMar>
-        </w:tblPrEx>
         <w:tc>
           <w:tcPr>
             <w:tcW w:w="3500" w:type="dxa"/>
@@ -4204,12 +4042,21 @@
             <w:vAlign w:val="center"/>
           </w:tcPr>
           <w:p>
-            <w:r>
-              <w:rPr>
-                <w:sz w:val="20"/>
-                <w:szCs w:val="20"/>
-              </w:rPr>
-              <w:t>O(1) lookup speed</w:t>
+            <w:proofErr w:type="gramStart"/>
+            <w:r>
+              <w:rPr>
+                <w:sz w:val="20"/>
+                <w:szCs w:val="20"/>
+              </w:rPr>
+              <w:t>O(</w:t>
+            </w:r>
+            <w:proofErr w:type="gramEnd"/>
+            <w:r>
+              <w:rPr>
+                <w:sz w:val="20"/>
+                <w:szCs w:val="20"/>
+              </w:rPr>
+              <w:t>1) lookup speed</w:t>
             </w:r>
           </w:p>
         </w:tc>
@@ -4390,12 +4237,6 @@
         <w:gridCol w:w="9000"/>
       </w:tblGrid>
       <w:tr>
-        <w:tblPrEx>
-          <w:tblCellMar>
-            <w:top w:w="0" w:type="dxa"/>
-            <w:bottom w:w="0" w:type="dxa"/>
-          </w:tblCellMar>
-        </w:tblPrEx>
         <w:tc>
           <w:tcPr>
             <w:tcW w:w="9000" w:type="dxa"/>
@@ -4422,7 +4263,39 @@
                 <w:sz w:val="20"/>
                 <w:szCs w:val="20"/>
               </w:rPr>
-              <w:t>Current affairs refer to events and incidents that are happening in the present time and have an impact on society, politics, the economy, or other aspects of our daily lives. There are always numerous ongoing events around the world that fall under this category. Some of the major current affairs topics that have dominated headlines in recent times include the COVID-19 pandemic and its impact on health, economies, and societies worldwide. Another significant event is the ongoing climate change crisis and the need to take urgent action to reduce greenhouse gas emissions and mitigate the effects of global warming. Additionally, political events...</w:t>
+              <w:t xml:space="preserve">Current affairs refer to events and incidents that are happening </w:t>
+            </w:r>
+            <w:proofErr w:type="gramStart"/>
+            <w:r>
+              <w:rPr>
+                <w:sz w:val="20"/>
+                <w:szCs w:val="20"/>
+              </w:rPr>
+              <w:t>in</w:t>
+            </w:r>
+            <w:proofErr w:type="gramEnd"/>
+            <w:r>
+              <w:rPr>
+                <w:sz w:val="20"/>
+                <w:szCs w:val="20"/>
+              </w:rPr>
+              <w:t xml:space="preserve"> the present time and have an impact on society, politics, the economy, or other aspects of our daily lives. There are always numerous ongoing events around the world that fall under this category. Some of the major current </w:t>
+            </w:r>
+            <w:proofErr w:type="gramStart"/>
+            <w:r>
+              <w:rPr>
+                <w:sz w:val="20"/>
+                <w:szCs w:val="20"/>
+              </w:rPr>
+              <w:t>affairs</w:t>
+            </w:r>
+            <w:proofErr w:type="gramEnd"/>
+            <w:r>
+              <w:rPr>
+                <w:sz w:val="20"/>
+                <w:szCs w:val="20"/>
+              </w:rPr>
+              <w:t xml:space="preserve"> topics that have dominated headlines in recent times include the COVID-19 pandemic and its impact on health, economies, and societies worldwide. Another significant event is the ongoing climate change crisis and the need to take urgent action to reduce greenhouse gas emissions and mitigate the effects of global warming. Additionally, political events...</w:t>
             </w:r>
           </w:p>
         </w:tc>
@@ -4464,12 +4337,6 @@
         <w:gridCol w:w="4200"/>
       </w:tblGrid>
       <w:tr>
-        <w:tblPrEx>
-          <w:tblCellMar>
-            <w:top w:w="0" w:type="dxa"/>
-            <w:bottom w:w="0" w:type="dxa"/>
-          </w:tblCellMar>
-        </w:tblPrEx>
         <w:trPr>
           <w:tblHeader/>
         </w:trPr>
@@ -4577,12 +4444,6 @@
         </w:tc>
       </w:tr>
       <w:tr>
-        <w:tblPrEx>
-          <w:tblCellMar>
-            <w:top w:w="0" w:type="dxa"/>
-            <w:bottom w:w="0" w:type="dxa"/>
-          </w:tblCellMar>
-        </w:tblPrEx>
         <w:tc>
           <w:tcPr>
             <w:tcW w:w="3000" w:type="dxa"/>
@@ -4669,12 +4530,6 @@
         </w:tc>
       </w:tr>
       <w:tr>
-        <w:tblPrEx>
-          <w:tblCellMar>
-            <w:top w:w="0" w:type="dxa"/>
-            <w:bottom w:w="0" w:type="dxa"/>
-          </w:tblCellMar>
-        </w:tblPrEx>
         <w:tc>
           <w:tcPr>
             <w:tcW w:w="3000" w:type="dxa"/>
@@ -4761,12 +4616,6 @@
         </w:tc>
       </w:tr>
       <w:tr>
-        <w:tblPrEx>
-          <w:tblCellMar>
-            <w:top w:w="0" w:type="dxa"/>
-            <w:bottom w:w="0" w:type="dxa"/>
-          </w:tblCellMar>
-        </w:tblPrEx>
         <w:tc>
           <w:tcPr>
             <w:tcW w:w="3000" w:type="dxa"/>
@@ -4853,12 +4702,6 @@
         </w:tc>
       </w:tr>
       <w:tr>
-        <w:tblPrEx>
-          <w:tblCellMar>
-            <w:top w:w="0" w:type="dxa"/>
-            <w:bottom w:w="0" w:type="dxa"/>
-          </w:tblCellMar>
-        </w:tblPrEx>
         <w:tc>
           <w:tcPr>
             <w:tcW w:w="3000" w:type="dxa"/>
@@ -4945,12 +4788,6 @@
         </w:tc>
       </w:tr>
       <w:tr>
-        <w:tblPrEx>
-          <w:tblCellMar>
-            <w:top w:w="0" w:type="dxa"/>
-            <w:bottom w:w="0" w:type="dxa"/>
-          </w:tblCellMar>
-        </w:tblPrEx>
         <w:tc>
           <w:tcPr>
             <w:tcW w:w="3000" w:type="dxa"/>
@@ -5072,12 +4909,6 @@
         <w:gridCol w:w="8000"/>
       </w:tblGrid>
       <w:tr>
-        <w:tblPrEx>
-          <w:tblCellMar>
-            <w:top w:w="0" w:type="dxa"/>
-            <w:bottom w:w="0" w:type="dxa"/>
-          </w:tblCellMar>
-        </w:tblPrEx>
         <w:trPr>
           <w:tblHeader/>
         </w:trPr>
@@ -5152,12 +4983,6 @@
         </w:tc>
       </w:tr>
       <w:tr>
-        <w:tblPrEx>
-          <w:tblCellMar>
-            <w:top w:w="0" w:type="dxa"/>
-            <w:bottom w:w="0" w:type="dxa"/>
-          </w:tblCellMar>
-        </w:tblPrEx>
         <w:tc>
           <w:tcPr>
             <w:tcW w:w="1000" w:type="dxa"/>
@@ -5216,12 +5041,6 @@
         </w:tc>
       </w:tr>
       <w:tr>
-        <w:tblPrEx>
-          <w:tblCellMar>
-            <w:top w:w="0" w:type="dxa"/>
-            <w:bottom w:w="0" w:type="dxa"/>
-          </w:tblCellMar>
-        </w:tblPrEx>
         <w:tc>
           <w:tcPr>
             <w:tcW w:w="1000" w:type="dxa"/>
@@ -5280,12 +5099,6 @@
         </w:tc>
       </w:tr>
       <w:tr>
-        <w:tblPrEx>
-          <w:tblCellMar>
-            <w:top w:w="0" w:type="dxa"/>
-            <w:bottom w:w="0" w:type="dxa"/>
-          </w:tblCellMar>
-        </w:tblPrEx>
         <w:tc>
           <w:tcPr>
             <w:tcW w:w="1000" w:type="dxa"/>
@@ -5344,12 +5157,6 @@
         </w:tc>
       </w:tr>
       <w:tr>
-        <w:tblPrEx>
-          <w:tblCellMar>
-            <w:top w:w="0" w:type="dxa"/>
-            <w:bottom w:w="0" w:type="dxa"/>
-          </w:tblCellMar>
-        </w:tblPrEx>
         <w:tc>
           <w:tcPr>
             <w:tcW w:w="1000" w:type="dxa"/>
@@ -5408,12 +5215,6 @@
         </w:tc>
       </w:tr>
       <w:tr>
-        <w:tblPrEx>
-          <w:tblCellMar>
-            <w:top w:w="0" w:type="dxa"/>
-            <w:bottom w:w="0" w:type="dxa"/>
-          </w:tblCellMar>
-        </w:tblPrEx>
         <w:tc>
           <w:tcPr>
             <w:tcW w:w="1000" w:type="dxa"/>
@@ -5472,12 +5273,6 @@
         </w:tc>
       </w:tr>
       <w:tr>
-        <w:tblPrEx>
-          <w:tblCellMar>
-            <w:top w:w="0" w:type="dxa"/>
-            <w:bottom w:w="0" w:type="dxa"/>
-          </w:tblCellMar>
-        </w:tblPrEx>
         <w:tc>
           <w:tcPr>
             <w:tcW w:w="1000" w:type="dxa"/>
@@ -5536,12 +5331,6 @@
         </w:tc>
       </w:tr>
       <w:tr>
-        <w:tblPrEx>
-          <w:tblCellMar>
-            <w:top w:w="0" w:type="dxa"/>
-            <w:bottom w:w="0" w:type="dxa"/>
-          </w:tblCellMar>
-        </w:tblPrEx>
         <w:tc>
           <w:tcPr>
             <w:tcW w:w="1000" w:type="dxa"/>
@@ -5594,18 +5383,28 @@
                 <w:sz w:val="20"/>
                 <w:szCs w:val="20"/>
               </w:rPr>
-              <w:t>the world that fall under this category</w:t>
+              <w:t xml:space="preserve">the world that </w:t>
+            </w:r>
+            <w:proofErr w:type="gramStart"/>
+            <w:r>
+              <w:rPr>
+                <w:sz w:val="20"/>
+                <w:szCs w:val="20"/>
+              </w:rPr>
+              <w:t>fall</w:t>
+            </w:r>
+            <w:proofErr w:type="gramEnd"/>
+            <w:r>
+              <w:rPr>
+                <w:sz w:val="20"/>
+                <w:szCs w:val="20"/>
+              </w:rPr>
+              <w:t xml:space="preserve"> under this category</w:t>
             </w:r>
           </w:p>
         </w:tc>
       </w:tr>
       <w:tr>
-        <w:tblPrEx>
-          <w:tblCellMar>
-            <w:top w:w="0" w:type="dxa"/>
-            <w:bottom w:w="0" w:type="dxa"/>
-          </w:tblCellMar>
-        </w:tblPrEx>
         <w:tc>
           <w:tcPr>
             <w:tcW w:w="1000" w:type="dxa"/>
@@ -5664,12 +5463,6 @@
         </w:tc>
       </w:tr>
       <w:tr>
-        <w:tblPrEx>
-          <w:tblCellMar>
-            <w:top w:w="0" w:type="dxa"/>
-            <w:bottom w:w="0" w:type="dxa"/>
-          </w:tblCellMar>
-        </w:tblPrEx>
         <w:tc>
           <w:tcPr>
             <w:tcW w:w="1000" w:type="dxa"/>
@@ -5728,12 +5521,6 @@
         </w:tc>
       </w:tr>
       <w:tr>
-        <w:tblPrEx>
-          <w:tblCellMar>
-            <w:top w:w="0" w:type="dxa"/>
-            <w:bottom w:w="0" w:type="dxa"/>
-          </w:tblCellMar>
-        </w:tblPrEx>
         <w:tc>
           <w:tcPr>
             <w:tcW w:w="1000" w:type="dxa"/>
@@ -5792,12 +5579,6 @@
         </w:tc>
       </w:tr>
       <w:tr>
-        <w:tblPrEx>
-          <w:tblCellMar>
-            <w:top w:w="0" w:type="dxa"/>
-            <w:bottom w:w="0" w:type="dxa"/>
-          </w:tblCellMar>
-        </w:tblPrEx>
         <w:tc>
           <w:tcPr>
             <w:tcW w:w="1000" w:type="dxa"/>
@@ -5856,12 +5637,6 @@
         </w:tc>
       </w:tr>
       <w:tr>
-        <w:tblPrEx>
-          <w:tblCellMar>
-            <w:top w:w="0" w:type="dxa"/>
-            <w:bottom w:w="0" w:type="dxa"/>
-          </w:tblCellMar>
-        </w:tblPrEx>
         <w:tc>
           <w:tcPr>
             <w:tcW w:w="1000" w:type="dxa"/>
@@ -5920,12 +5695,6 @@
         </w:tc>
       </w:tr>
       <w:tr>
-        <w:tblPrEx>
-          <w:tblCellMar>
-            <w:top w:w="0" w:type="dxa"/>
-            <w:bottom w:w="0" w:type="dxa"/>
-          </w:tblCellMar>
-        </w:tblPrEx>
         <w:tc>
           <w:tcPr>
             <w:tcW w:w="1000" w:type="dxa"/>
@@ -5973,23 +5742,26 @@
             <w:vAlign w:val="center"/>
           </w:tcPr>
           <w:p>
-            <w:r>
-              <w:rPr>
-                <w:sz w:val="20"/>
-                <w:szCs w:val="20"/>
-              </w:rPr>
-              <w:t>another significant event is the</w:t>
+            <w:proofErr w:type="gramStart"/>
+            <w:r>
+              <w:rPr>
+                <w:sz w:val="20"/>
+                <w:szCs w:val="20"/>
+              </w:rPr>
+              <w:t>another</w:t>
+            </w:r>
+            <w:proofErr w:type="gramEnd"/>
+            <w:r>
+              <w:rPr>
+                <w:sz w:val="20"/>
+                <w:szCs w:val="20"/>
+              </w:rPr>
+              <w:t xml:space="preserve"> significant event is the</w:t>
             </w:r>
           </w:p>
         </w:tc>
       </w:tr>
       <w:tr>
-        <w:tblPrEx>
-          <w:tblCellMar>
-            <w:top w:w="0" w:type="dxa"/>
-            <w:bottom w:w="0" w:type="dxa"/>
-          </w:tblCellMar>
-        </w:tblPrEx>
         <w:tc>
           <w:tcPr>
             <w:tcW w:w="1000" w:type="dxa"/>
@@ -6048,12 +5820,6 @@
         </w:tc>
       </w:tr>
       <w:tr>
-        <w:tblPrEx>
-          <w:tblCellMar>
-            <w:top w:w="0" w:type="dxa"/>
-            <w:bottom w:w="0" w:type="dxa"/>
-          </w:tblCellMar>
-        </w:tblPrEx>
         <w:tc>
           <w:tcPr>
             <w:tcW w:w="1000" w:type="dxa"/>
@@ -6112,12 +5878,6 @@
         </w:tc>
       </w:tr>
       <w:tr>
-        <w:tblPrEx>
-          <w:tblCellMar>
-            <w:top w:w="0" w:type="dxa"/>
-            <w:bottom w:w="0" w:type="dxa"/>
-          </w:tblCellMar>
-        </w:tblPrEx>
         <w:tc>
           <w:tcPr>
             <w:tcW w:w="1000" w:type="dxa"/>
@@ -6176,12 +5936,6 @@
         </w:tc>
       </w:tr>
       <w:tr>
-        <w:tblPrEx>
-          <w:tblCellMar>
-            <w:top w:w="0" w:type="dxa"/>
-            <w:bottom w:w="0" w:type="dxa"/>
-          </w:tblCellMar>
-        </w:tblPrEx>
         <w:tc>
           <w:tcPr>
             <w:tcW w:w="1000" w:type="dxa"/>
@@ -6240,12 +5994,6 @@
         </w:tc>
       </w:tr>
       <w:tr>
-        <w:tblPrEx>
-          <w:tblCellMar>
-            <w:top w:w="0" w:type="dxa"/>
-            <w:bottom w:w="0" w:type="dxa"/>
-          </w:tblCellMar>
-        </w:tblPrEx>
         <w:tc>
           <w:tcPr>
             <w:tcW w:w="1000" w:type="dxa"/>
@@ -6293,12 +6041,21 @@
             <w:vAlign w:val="center"/>
           </w:tcPr>
           <w:p>
-            <w:r>
-              <w:rPr>
-                <w:sz w:val="20"/>
-                <w:szCs w:val="20"/>
-              </w:rPr>
-              <w:t>additionally political events</w:t>
+            <w:proofErr w:type="gramStart"/>
+            <w:r>
+              <w:rPr>
+                <w:sz w:val="20"/>
+                <w:szCs w:val="20"/>
+              </w:rPr>
+              <w:t>additionally</w:t>
+            </w:r>
+            <w:proofErr w:type="gramEnd"/>
+            <w:r>
+              <w:rPr>
+                <w:sz w:val="20"/>
+                <w:szCs w:val="20"/>
+              </w:rPr>
+              <w:t xml:space="preserve"> political events</w:t>
             </w:r>
           </w:p>
         </w:tc>
@@ -6438,7 +6195,15 @@
         <w:spacing w:before="60" w:after="60"/>
       </w:pPr>
       <w:r>
-        <w:t>Adaptive calibration: Replace fixed spacing with automatic measurement using advanced techniques like Hough transform or DBSCAN clustering.</w:t>
+        <w:t xml:space="preserve">Adaptive calibration: Replace fixed spacing with automatic measurement using advanced techniques like Hough </w:t>
+      </w:r>
+      <w:proofErr w:type="gramStart"/>
+      <w:r>
+        <w:t>transform</w:t>
+      </w:r>
+      <w:proofErr w:type="gramEnd"/>
+      <w:r>
+        <w:t xml:space="preserve"> or DBSCAN clustering.</w:t>
       </w:r>
     </w:p>
     <w:p>
@@ -6579,8 +6344,8 @@
       </w:r>
     </w:p>
     <w:sectPr>
-      <w:headerReference w:type="default" r:id="rId7"/>
-      <w:footerReference w:type="default" r:id="rId8"/>
+      <w:headerReference w:type="default" r:id="rId8"/>
+      <w:footerReference w:type="default" r:id="rId9"/>
       <w:pgSz w:w="12240" w:h="15840"/>
       <w:pgMar w:top="1440" w:right="1260" w:bottom="1440" w:left="1260" w:header="708" w:footer="708" w:gutter="0"/>
       <w:cols w:space="720"/>
@@ -6712,14 +6477,48 @@
         <w:sz w:val="18"/>
         <w:szCs w:val="18"/>
       </w:rPr>
-      <w:t>Braille Character Recognition  |  Bahria University</w:t>
+      <w:t xml:space="preserve">Braille Character </w:t>
+    </w:r>
+    <w:proofErr w:type="gramStart"/>
+    <w:r>
+      <w:rPr>
+        <w:color w:val="2E75B6"/>
+        <w:sz w:val="18"/>
+        <w:szCs w:val="18"/>
+      </w:rPr>
+      <w:t>Recognition  |</w:t>
+    </w:r>
+    <w:proofErr w:type="gramEnd"/>
+    <w:r>
+      <w:rPr>
+        <w:color w:val="2E75B6"/>
+        <w:sz w:val="18"/>
+        <w:szCs w:val="18"/>
+      </w:rPr>
+      <w:t xml:space="preserve">  Bahria University</w:t>
     </w:r>
     <w:r>
       <w:rPr>
         <w:sz w:val="18"/>
         <w:szCs w:val="18"/>
       </w:rPr>
-      <w:t xml:space="preserve">   Muhammad Hamza  |  01-131232-057</w:t>
+      <w:t xml:space="preserve">   Muhammad </w:t>
+    </w:r>
+    <w:proofErr w:type="gramStart"/>
+    <w:r>
+      <w:rPr>
+        <w:sz w:val="18"/>
+        <w:szCs w:val="18"/>
+      </w:rPr>
+      <w:t>Hamza  |</w:t>
+    </w:r>
+    <w:proofErr w:type="gramEnd"/>
+    <w:r>
+      <w:rPr>
+        <w:sz w:val="18"/>
+        <w:szCs w:val="18"/>
+      </w:rPr>
+      <w:t xml:space="preserve">  01-131232-057</w:t>
     </w:r>
   </w:p>
 </w:hdr>
@@ -7515,6 +7314,30 @@
       <w:szCs w:val="20"/>
     </w:rPr>
   </w:style>
+  <w:style w:type="character" w:styleId="UnresolvedMention">
+    <w:name w:val="Unresolved Mention"/>
+    <w:basedOn w:val="DefaultParagraphFont"/>
+    <w:uiPriority w:val="99"/>
+    <w:semiHidden/>
+    <w:unhideWhenUsed/>
+    <w:rsid w:val="001D59B3"/>
+    <w:rPr>
+      <w:color w:val="605E5C"/>
+      <w:shd w:val="clear" w:color="auto" w:fill="E1DFDD"/>
+    </w:rPr>
+  </w:style>
+  <w:style w:type="character" w:styleId="FollowedHyperlink">
+    <w:name w:val="FollowedHyperlink"/>
+    <w:basedOn w:val="DefaultParagraphFont"/>
+    <w:uiPriority w:val="99"/>
+    <w:semiHidden/>
+    <w:unhideWhenUsed/>
+    <w:rsid w:val="001D59B3"/>
+    <w:rPr>
+      <w:color w:val="96607D" w:themeColor="followedHyperlink"/>
+      <w:u w:val="single"/>
+    </w:rPr>
+  </w:style>
 </w:styles>
 </file>
 

</xml_diff>